<commit_message>
Fix stale reassessment cadence in Rena Paul's Assessment Report — all 3 rendered locations
The 8/19 daily audit found the retired '8-12 weeks' strength-reassessment
language in three places (protocolIntro, the Reassessment Next Steps card,
and an '8-week baseline' observation phrase), contradicting her own
restructured training plan's corrected two-clock cadence. All three now
state the 4-week strength / 8-12 week Styku split; regenerated and
verified. CLAUDE.md's standing flag marked resolved with the three-location
detail for future Assessment Report builds.

Co-Authored-By: Claude Fable 5 <noreply@anthropic.com>
Claude-Session: https://claude.ai/code/session_01VTRA12TAy4P16NRVKS4SK5
</commit_message>
<xml_diff>
--- a/clients/rena_paul/Rena_Paul_ICONS_Performance_Assessment.docx
+++ b/clients/rena_paul/Rena_Paul_ICONS_Performance_Assessment.docx
@@ -1742,7 +1742,7 @@
                 <w:sz w:val="16"/>
                 <w:szCs w:val="16"/>
               </w:rPr>
-              <w:t xml:space="preserve">ICONS Protocol: 10 core movements + 1 bonus, assessed on weight lifted, reps, and movement quality. Reassessed every 8–12 weeks. Benchmarks: Aesthetics · Health · Biological Age | Mobility &amp; flexibility assessed as part of the longevity factor.</w:t>
+              <w:t xml:space="preserve">ICONS Protocol: 10 core movements + 1 bonus, assessed on weight lifted, reps, and movement quality. Strength is re-checked every 4 weeks against the program's Week 4 targets; the full body-composition rescan runs on its own longer 8–12 week cycle. Benchmarks: Aesthetics · Health · Biological Age | Mobility &amp; flexibility assessed as part of the longevity factor.</w:t>
             </w:r>
           </w:p>
         </w:tc>
@@ -7042,7 +7042,7 @@
                 <w:sz w:val="15"/>
                 <w:szCs w:val="15"/>
               </w:rPr>
-              <w:t xml:space="preserve">Back Squat was not part of the original 11-exercise testing battery — a working Goblet Squat load (30 lbs) was established this program and becomes the new 8-week baseline to track from here.</w:t>
+              <w:t xml:space="preserve">Back Squat was not part of the original 11-exercise testing battery — a working Goblet Squat load (30 lbs) was established this program and becomes the new baseline to track from here, first re-checked at the 4-week strength reassessment.</w:t>
             </w:r>
           </w:p>
         </w:tc>
@@ -7539,7 +7539,7 @@
                 <w:sz w:val="16"/>
                 <w:szCs w:val="16"/>
               </w:rPr>
-              <w:t xml:space="preserve">Reassessment — 8 to 12 Weeks</w:t>
+              <w:t xml:space="preserve">Reassessment — Two Clocks</w:t>
             </w:r>
           </w:p>
           <w:p>
@@ -7550,7 +7550,7 @@
                 <w:sz w:val="14"/>
                 <w:szCs w:val="14"/>
               </w:rPr>
-              <w:t xml:space="preserve">ICONS Index reassessment at 8 weeks to track strength gains, body-composition shifts, and the segmental gaps noted above.</w:t>
+              <w:t xml:space="preserve">Strength (ICONS Index) is re-checked every 4 weeks against the program's Week 4 targets; the Styku body-composition rescan runs on its own 8–12 week cycle and tracks the segmental gaps noted above. The two are tracked separately, not on the same clock.</w:t>
             </w:r>
           </w:p>
         </w:tc>

</xml_diff>